<commit_message>
stage 9: multiple spikes
</commit_message>
<xml_diff>
--- a/Coding outlinr.docx
+++ b/Coding outlinr.docx
@@ -495,7 +495,7 @@
         </w:rPr>
       </w:r>
       <w:r>
-        <w:pict w14:anchorId="74AF2AF1">
+        <w:pict w14:anchorId="53120825">
           <v:rect id="Horizontal Line 1" o:spid="_x0000_s1042" style="width:468pt;height:.05pt;visibility:visible;mso-wrap-style:square;mso-left-percent:-10001;mso-top-percent:-10001;mso-position-horizontal:absolute;mso-position-horizontal-relative:char;mso-position-vertical:absolute;mso-position-vertical-relative:line;mso-left-percent:-10001;mso-top-percent:-10001;v-text-anchor:top" o:gfxdata="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" filled="f">
             <o:lock v:ext="edit" rotation="t" aspectratio="t" verticies="t" text="t" shapetype="t"/>
             <w10:anchorlock/>
@@ -1573,7 +1573,7 @@
         </w:rPr>
       </w:r>
       <w:r>
-        <w:pict w14:anchorId="762154D5">
+        <w:pict w14:anchorId="5ABD7978">
           <v:rect id="Horizontal Line 2" o:spid="_x0000_s1041" style="width:468pt;height:1.1pt;visibility:visible;mso-wrap-style:square;mso-left-percent:-10001;mso-top-percent:-10001;mso-position-horizontal:absolute;mso-position-horizontal-relative:char;mso-position-vertical:absolute;mso-position-vertical-relative:line;mso-left-percent:-10001;mso-top-percent:-10001;v-text-anchor:top" o:gfxdata="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" filled="f">
             <o:lock v:ext="edit" rotation="t" aspectratio="t" verticies="t" text="t" shapetype="t"/>
             <w10:anchorlock/>
@@ -2255,7 +2255,7 @@
         </w:rPr>
       </w:r>
       <w:r>
-        <w:pict w14:anchorId="5B13E641">
+        <w:pict w14:anchorId="2F27C54F">
           <v:rect id="Horizontal Line 3" o:spid="_x0000_s1040" style="width:468pt;height:1.1pt;visibility:visible;mso-wrap-style:square;mso-left-percent:-10001;mso-top-percent:-10001;mso-position-horizontal:absolute;mso-position-horizontal-relative:char;mso-position-vertical:absolute;mso-position-vertical-relative:line;mso-left-percent:-10001;mso-top-percent:-10001;v-text-anchor:top" o:gfxdata="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" filled="f">
             <o:lock v:ext="edit" rotation="t" aspectratio="t" verticies="t" text="t" shapetype="t"/>
             <w10:anchorlock/>
@@ -2909,7 +2909,7 @@
         </w:rPr>
       </w:r>
       <w:r>
-        <w:pict w14:anchorId="29249E09">
+        <w:pict w14:anchorId="4C1219F3">
           <v:rect id="Horizontal Line 4" o:spid="_x0000_s1039" style="width:468pt;height:1.1pt;visibility:visible;mso-wrap-style:square;mso-left-percent:-10001;mso-top-percent:-10001;mso-position-horizontal:absolute;mso-position-horizontal-relative:char;mso-position-vertical:absolute;mso-position-vertical-relative:line;mso-left-percent:-10001;mso-top-percent:-10001;v-text-anchor:top" o:gfxdata="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" filled="f">
             <o:lock v:ext="edit" rotation="t" aspectratio="t" verticies="t" text="t" shapetype="t"/>
             <w10:anchorlock/>
@@ -3409,7 +3409,7 @@
         </w:rPr>
       </w:r>
       <w:r>
-        <w:pict w14:anchorId="306CD897">
+        <w:pict w14:anchorId="21A2BF0B">
           <v:rect id="Horizontal Line 5" o:spid="_x0000_s1038" style="width:468pt;height:1.1pt;visibility:visible;mso-wrap-style:square;mso-left-percent:-10001;mso-top-percent:-10001;mso-position-horizontal:absolute;mso-position-horizontal-relative:char;mso-position-vertical:absolute;mso-position-vertical-relative:line;mso-left-percent:-10001;mso-top-percent:-10001;v-text-anchor:top" o:gfxdata="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" filled="f">
             <o:lock v:ext="edit" rotation="t" aspectratio="t" verticies="t" text="t" shapetype="t"/>
             <w10:anchorlock/>
@@ -3937,7 +3937,7 @@
         </w:rPr>
       </w:r>
       <w:r>
-        <w:pict w14:anchorId="0D86C1B9">
+        <w:pict w14:anchorId="213780F6">
           <v:rect id="Horizontal Line 6" o:spid="_x0000_s1037" style="width:468pt;height:.05pt;visibility:visible;mso-wrap-style:square;mso-left-percent:-10001;mso-top-percent:-10001;mso-position-horizontal:absolute;mso-position-horizontal-relative:char;mso-position-vertical:absolute;mso-position-vertical-relative:line;mso-left-percent:-10001;mso-top-percent:-10001;v-text-anchor:top" o:gfxdata="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" filled="f">
             <o:lock v:ext="edit" rotation="t" aspectratio="t" verticies="t" text="t" shapetype="t"/>
             <w10:anchorlock/>
@@ -4406,7 +4406,7 @@
         </w:rPr>
       </w:r>
       <w:r>
-        <w:pict w14:anchorId="2439D9FB">
+        <w:pict w14:anchorId="4F1103A9">
           <v:rect id="Horizontal Line 7" o:spid="_x0000_s1036" style="width:468pt;height:1.1pt;visibility:visible;mso-wrap-style:square;mso-left-percent:-10001;mso-top-percent:-10001;mso-position-horizontal:absolute;mso-position-horizontal-relative:char;mso-position-vertical:absolute;mso-position-vertical-relative:line;mso-left-percent:-10001;mso-top-percent:-10001;v-text-anchor:top" o:gfxdata="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" filled="f">
             <o:lock v:ext="edit" rotation="t" aspectratio="t" verticies="t" text="t" shapetype="t"/>
             <w10:anchorlock/>
@@ -4465,7 +4465,7 @@
           <w:szCs w:val="48"/>
           <w14:ligatures w14:val="none"/>
         </w:rPr>
-        <w:t>Edit: Jumping will be implemented as well (Stage 7A)</w:t>
+        <w:t>Edit: Jumping will be implemented as well</w:t>
       </w:r>
     </w:p>
     <w:p>
@@ -4661,65 +4661,65 @@
           <w:szCs w:val="20"/>
           <w14:ligatures w14:val="none"/>
         </w:rPr>
+        <w:t>std::vector&lt;Spike&gt; spikes;</w:t>
+      </w:r>
+    </w:p>
+    <w:p>
+      <w:pPr>
+        <w:tabs>
+          <w:tab w:val="left" w:pos="916"/>
+          <w:tab w:val="left" w:pos="1832"/>
+          <w:tab w:val="left" w:pos="2748"/>
+          <w:tab w:val="left" w:pos="3664"/>
+          <w:tab w:val="left" w:pos="4580"/>
+          <w:tab w:val="left" w:pos="5496"/>
+          <w:tab w:val="left" w:pos="6412"/>
+          <w:tab w:val="left" w:pos="7328"/>
+          <w:tab w:val="left" w:pos="8244"/>
+          <w:tab w:val="left" w:pos="9160"/>
+          <w:tab w:val="left" w:pos="10076"/>
+          <w:tab w:val="left" w:pos="10992"/>
+          <w:tab w:val="left" w:pos="11908"/>
+          <w:tab w:val="left" w:pos="12824"/>
+          <w:tab w:val="left" w:pos="13740"/>
+          <w:tab w:val="left" w:pos="14656"/>
+        </w:tabs>
+        <w:spacing w:after="0" w:line="240" w:lineRule="auto"/>
+        <w:rPr>
+          <w:rFonts w:ascii="Courier New" w:eastAsia="Times New Roman" w:hAnsi="Courier New" w:cs="Courier New"/>
+          <w:kern w:val="0"/>
+          <w:sz w:val="20"/>
+          <w:szCs w:val="20"/>
+          <w14:ligatures w14:val="none"/>
+        </w:rPr>
+      </w:pPr>
+      <w:r>
+        <w:rPr>
+          <w:rFonts w:ascii="Courier New" w:eastAsia="Times New Roman" w:hAnsi="Courier New" w:cs="Courier New"/>
+          <w:kern w:val="0"/>
+          <w:sz w:val="20"/>
+          <w:szCs w:val="20"/>
+          <w14:ligatures w14:val="none"/>
+        </w:rPr>
+        <w:t>std::vector&lt;Platform&gt; platforms;</w:t>
+      </w:r>
+    </w:p>
+    <w:p>
+      <w:pPr>
+        <w:spacing w:before="100" w:beforeAutospacing="1" w:after="100" w:afterAutospacing="1" w:line="240" w:lineRule="auto"/>
+        <w:rPr>
+          <w:rFonts w:ascii="Times New Roman" w:eastAsia="Times New Roman" w:hAnsi="Times New Roman" w:cs="Times New Roman"/>
+          <w:kern w:val="0"/>
+          <w14:ligatures w14:val="none"/>
+        </w:rPr>
+      </w:pPr>
+      <w:r>
+        <w:rPr>
+          <w:rFonts w:ascii="Times New Roman" w:eastAsia="Times New Roman" w:hAnsi="Times New Roman" w:cs="Times New Roman"/>
+          <w:kern w:val="0"/>
+          <w14:ligatures w14:val="none"/>
+        </w:rPr>
         <w:lastRenderedPageBreak/>
-        <w:t>std::vector&lt;Spike&gt; spikes;</w:t>
-      </w:r>
-    </w:p>
-    <w:p>
-      <w:pPr>
-        <w:tabs>
-          <w:tab w:val="left" w:pos="916"/>
-          <w:tab w:val="left" w:pos="1832"/>
-          <w:tab w:val="left" w:pos="2748"/>
-          <w:tab w:val="left" w:pos="3664"/>
-          <w:tab w:val="left" w:pos="4580"/>
-          <w:tab w:val="left" w:pos="5496"/>
-          <w:tab w:val="left" w:pos="6412"/>
-          <w:tab w:val="left" w:pos="7328"/>
-          <w:tab w:val="left" w:pos="8244"/>
-          <w:tab w:val="left" w:pos="9160"/>
-          <w:tab w:val="left" w:pos="10076"/>
-          <w:tab w:val="left" w:pos="10992"/>
-          <w:tab w:val="left" w:pos="11908"/>
-          <w:tab w:val="left" w:pos="12824"/>
-          <w:tab w:val="left" w:pos="13740"/>
-          <w:tab w:val="left" w:pos="14656"/>
-        </w:tabs>
-        <w:spacing w:after="0" w:line="240" w:lineRule="auto"/>
-        <w:rPr>
-          <w:rFonts w:ascii="Courier New" w:eastAsia="Times New Roman" w:hAnsi="Courier New" w:cs="Courier New"/>
-          <w:kern w:val="0"/>
-          <w:sz w:val="20"/>
-          <w:szCs w:val="20"/>
-          <w14:ligatures w14:val="none"/>
-        </w:rPr>
-      </w:pPr>
-      <w:r>
-        <w:rPr>
-          <w:rFonts w:ascii="Courier New" w:eastAsia="Times New Roman" w:hAnsi="Courier New" w:cs="Courier New"/>
-          <w:kern w:val="0"/>
-          <w:sz w:val="20"/>
-          <w:szCs w:val="20"/>
-          <w14:ligatures w14:val="none"/>
-        </w:rPr>
-        <w:t>std::vector&lt;Platform&gt; platforms;</w:t>
-      </w:r>
-    </w:p>
-    <w:p>
-      <w:pPr>
-        <w:spacing w:before="100" w:beforeAutospacing="1" w:after="100" w:afterAutospacing="1" w:line="240" w:lineRule="auto"/>
-        <w:rPr>
-          <w:rFonts w:ascii="Times New Roman" w:eastAsia="Times New Roman" w:hAnsi="Times New Roman" w:cs="Times New Roman"/>
-          <w:kern w:val="0"/>
-          <w14:ligatures w14:val="none"/>
-        </w:rPr>
-      </w:pPr>
-      <w:r>
-        <w:rPr>
-          <w:rFonts w:ascii="Times New Roman" w:eastAsia="Times New Roman" w:hAnsi="Times New Roman" w:cs="Times New Roman"/>
-          <w:kern w:val="0"/>
-          <w14:ligatures w14:val="none"/>
-        </w:rPr>
         <w:t>Then update or draw them with loops:</w:t>
       </w:r>
     </w:p>
@@ -4969,7 +4969,7 @@
         </w:rPr>
       </w:r>
       <w:r>
-        <w:pict w14:anchorId="2A581257">
+        <w:pict w14:anchorId="19AD01F2">
           <v:rect id="Horizontal Line 8" o:spid="_x0000_s1035" style="width:468pt;height:1.1pt;visibility:visible;mso-wrap-style:square;mso-left-percent:-10001;mso-top-percent:-10001;mso-position-horizontal:absolute;mso-position-horizontal-relative:char;mso-position-vertical:absolute;mso-position-vertical-relative:line;mso-left-percent:-10001;mso-top-percent:-10001;v-text-anchor:top" o:gfxdata="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" filled="f">
             <o:lock v:ext="edit" rotation="t" aspectratio="t" verticies="t" text="t" shapetype="t"/>
             <w10:anchorlock/>
@@ -5358,7 +5358,7 @@
         </w:rPr>
       </w:r>
       <w:r>
-        <w:pict w14:anchorId="167D7DF2">
+        <w:pict w14:anchorId="29CA39DC">
           <v:rect id="Horizontal Line 9" o:spid="_x0000_s1034" style="width:468pt;height:1.1pt;visibility:visible;mso-wrap-style:square;mso-left-percent:-10001;mso-top-percent:-10001;mso-position-horizontal:absolute;mso-position-horizontal-relative:char;mso-position-vertical:absolute;mso-position-vertical-relative:line;mso-left-percent:-10001;mso-top-percent:-10001;v-text-anchor:top" o:gfxdata="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" filled="f">
             <o:lock v:ext="edit" rotation="t" aspectratio="t" verticies="t" text="t" shapetype="t"/>
             <w10:anchorlock/>
@@ -5390,6 +5390,7 @@
           <w:szCs w:val="48"/>
           <w14:ligatures w14:val="none"/>
         </w:rPr>
+        <w:lastRenderedPageBreak/>
         <w:t xml:space="preserve">Stage 9 — </w:t>
       </w:r>
     </w:p>
@@ -6646,7 +6647,7 @@
         </w:rPr>
       </w:r>
       <w:r>
-        <w:pict w14:anchorId="7948C95B">
+        <w:pict w14:anchorId="69A4DABC">
           <v:rect id="Horizontal Line 10" o:spid="_x0000_s1033" style="width:468pt;height:1.1pt;visibility:visible;mso-wrap-style:square;mso-left-percent:-10001;mso-top-percent:-10001;mso-position-horizontal:absolute;mso-position-horizontal-relative:char;mso-position-vertical:absolute;mso-position-vertical-relative:line;mso-left-percent:-10001;mso-top-percent:-10001;v-text-anchor:top" o:gfxdata="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" filled="f">
             <o:lock v:ext="edit" rotation="t" aspectratio="t" verticies="t" text="t" shapetype="t"/>
             <w10:anchorlock/>
@@ -6678,6 +6679,7 @@
           <w:szCs w:val="48"/>
           <w14:ligatures w14:val="none"/>
         </w:rPr>
+        <w:lastRenderedPageBreak/>
         <w:t xml:space="preserve">Stage 10 — Common </w:t>
       </w:r>
     </w:p>
@@ -7396,7 +7398,7 @@
         </w:rPr>
       </w:r>
       <w:r>
-        <w:pict w14:anchorId="02C7A694">
+        <w:pict w14:anchorId="7E8B4003">
           <v:rect id="Horizontal Line 11" o:spid="_x0000_s1032" style="width:468pt;height:1.1pt;visibility:visible;mso-wrap-style:square;mso-left-percent:-10001;mso-top-percent:-10001;mso-position-horizontal:absolute;mso-position-horizontal-relative:char;mso-position-vertical:absolute;mso-position-vertical-relative:line;mso-left-percent:-10001;mso-top-percent:-10001;v-text-anchor:top" o:gfxdata="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" filled="f">
             <o:lock v:ext="edit" rotation="t" aspectratio="t" verticies="t" text="t" shapetype="t"/>
             <w10:anchorlock/>
@@ -7500,47 +7502,47 @@
           <w:kern w:val="0"/>
           <w14:ligatures w14:val="none"/>
         </w:rPr>
+        <w:t>Files:</w:t>
+      </w:r>
+    </w:p>
+    <w:p>
+      <w:pPr>
+        <w:tabs>
+          <w:tab w:val="left" w:pos="916"/>
+          <w:tab w:val="left" w:pos="1832"/>
+          <w:tab w:val="left" w:pos="2748"/>
+          <w:tab w:val="left" w:pos="3664"/>
+          <w:tab w:val="left" w:pos="4580"/>
+          <w:tab w:val="left" w:pos="5496"/>
+          <w:tab w:val="left" w:pos="6412"/>
+          <w:tab w:val="left" w:pos="7328"/>
+          <w:tab w:val="left" w:pos="8244"/>
+          <w:tab w:val="left" w:pos="9160"/>
+          <w:tab w:val="left" w:pos="10076"/>
+          <w:tab w:val="left" w:pos="10992"/>
+          <w:tab w:val="left" w:pos="11908"/>
+          <w:tab w:val="left" w:pos="12824"/>
+          <w:tab w:val="left" w:pos="13740"/>
+          <w:tab w:val="left" w:pos="14656"/>
+        </w:tabs>
+        <w:spacing w:after="0" w:line="240" w:lineRule="auto"/>
+        <w:rPr>
+          <w:rFonts w:ascii="Courier New" w:eastAsia="Times New Roman" w:hAnsi="Courier New" w:cs="Courier New"/>
+          <w:kern w:val="0"/>
+          <w:sz w:val="20"/>
+          <w:szCs w:val="20"/>
+          <w14:ligatures w14:val="none"/>
+        </w:rPr>
+      </w:pPr>
+      <w:r>
+        <w:rPr>
+          <w:rFonts w:ascii="Courier New" w:eastAsia="Times New Roman" w:hAnsi="Courier New" w:cs="Courier New"/>
+          <w:kern w:val="0"/>
+          <w:sz w:val="20"/>
+          <w:szCs w:val="20"/>
+          <w14:ligatures w14:val="none"/>
+        </w:rPr>
         <w:lastRenderedPageBreak/>
-        <w:t>Files:</w:t>
-      </w:r>
-    </w:p>
-    <w:p>
-      <w:pPr>
-        <w:tabs>
-          <w:tab w:val="left" w:pos="916"/>
-          <w:tab w:val="left" w:pos="1832"/>
-          <w:tab w:val="left" w:pos="2748"/>
-          <w:tab w:val="left" w:pos="3664"/>
-          <w:tab w:val="left" w:pos="4580"/>
-          <w:tab w:val="left" w:pos="5496"/>
-          <w:tab w:val="left" w:pos="6412"/>
-          <w:tab w:val="left" w:pos="7328"/>
-          <w:tab w:val="left" w:pos="8244"/>
-          <w:tab w:val="left" w:pos="9160"/>
-          <w:tab w:val="left" w:pos="10076"/>
-          <w:tab w:val="left" w:pos="10992"/>
-          <w:tab w:val="left" w:pos="11908"/>
-          <w:tab w:val="left" w:pos="12824"/>
-          <w:tab w:val="left" w:pos="13740"/>
-          <w:tab w:val="left" w:pos="14656"/>
-        </w:tabs>
-        <w:spacing w:after="0" w:line="240" w:lineRule="auto"/>
-        <w:rPr>
-          <w:rFonts w:ascii="Courier New" w:eastAsia="Times New Roman" w:hAnsi="Courier New" w:cs="Courier New"/>
-          <w:kern w:val="0"/>
-          <w:sz w:val="20"/>
-          <w:szCs w:val="20"/>
-          <w14:ligatures w14:val="none"/>
-        </w:rPr>
-      </w:pPr>
-      <w:r>
-        <w:rPr>
-          <w:rFonts w:ascii="Courier New" w:eastAsia="Times New Roman" w:hAnsi="Courier New" w:cs="Courier New"/>
-          <w:kern w:val="0"/>
-          <w:sz w:val="20"/>
-          <w:szCs w:val="20"/>
-          <w14:ligatures w14:val="none"/>
-        </w:rPr>
         <w:t>FinishLine.h</w:t>
       </w:r>
     </w:p>
@@ -8096,7 +8098,7 @@
         </w:rPr>
       </w:r>
       <w:r>
-        <w:pict w14:anchorId="76CFCA43">
+        <w:pict w14:anchorId="3BCC683E">
           <v:rect id="Horizontal Line 12" o:spid="_x0000_s1031" style="width:468pt;height:1.1pt;visibility:visible;mso-wrap-style:square;mso-left-percent:-10001;mso-top-percent:-10001;mso-position-horizontal:absolute;mso-position-horizontal-relative:char;mso-position-vertical:absolute;mso-position-vertical-relative:line;mso-left-percent:-10001;mso-top-percent:-10001;v-text-anchor:top" o:gfxdata="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" filled="f">
             <o:lock v:ext="edit" rotation="t" aspectratio="t" verticies="t" text="t" shapetype="t"/>
             <w10:anchorlock/>
@@ -8502,25 +8504,25 @@
           <w:szCs w:val="20"/>
           <w14:ligatures w14:val="none"/>
         </w:rPr>
+        <w:t>Level.cpp</w:t>
+      </w:r>
+    </w:p>
+    <w:p>
+      <w:pPr>
+        <w:spacing w:before="100" w:beforeAutospacing="1" w:after="100" w:afterAutospacing="1" w:line="240" w:lineRule="auto"/>
+        <w:rPr>
+          <w:rFonts w:ascii="Times New Roman" w:eastAsia="Times New Roman" w:hAnsi="Times New Roman" w:cs="Times New Roman"/>
+          <w:kern w:val="0"/>
+          <w14:ligatures w14:val="none"/>
+        </w:rPr>
+      </w:pPr>
+      <w:r>
+        <w:rPr>
+          <w:rFonts w:ascii="Times New Roman" w:eastAsia="Times New Roman" w:hAnsi="Times New Roman" w:cs="Times New Roman"/>
+          <w:kern w:val="0"/>
+          <w14:ligatures w14:val="none"/>
+        </w:rPr>
         <w:lastRenderedPageBreak/>
-        <w:t>Level.cpp</w:t>
-      </w:r>
-    </w:p>
-    <w:p>
-      <w:pPr>
-        <w:spacing w:before="100" w:beforeAutospacing="1" w:after="100" w:afterAutospacing="1" w:line="240" w:lineRule="auto"/>
-        <w:rPr>
-          <w:rFonts w:ascii="Times New Roman" w:eastAsia="Times New Roman" w:hAnsi="Times New Roman" w:cs="Times New Roman"/>
-          <w:kern w:val="0"/>
-          <w14:ligatures w14:val="none"/>
-        </w:rPr>
-      </w:pPr>
-      <w:r>
-        <w:rPr>
-          <w:rFonts w:ascii="Times New Roman" w:eastAsia="Times New Roman" w:hAnsi="Times New Roman" w:cs="Times New Roman"/>
-          <w:kern w:val="0"/>
-          <w14:ligatures w14:val="none"/>
-        </w:rPr>
         <w:t>Possible functions:</w:t>
       </w:r>
     </w:p>
@@ -8754,7 +8756,7 @@
         </w:rPr>
       </w:r>
       <w:r>
-        <w:pict w14:anchorId="1609D3CD">
+        <w:pict w14:anchorId="5C81875E">
           <v:rect id="Horizontal Line 13" o:spid="_x0000_s1030" style="width:468pt;height:.05pt;visibility:visible;mso-wrap-style:square;mso-left-percent:-10001;mso-top-percent:-10001;mso-position-horizontal:absolute;mso-position-horizontal-relative:char;mso-position-vertical:absolute;mso-position-vertical-relative:line;mso-left-percent:-10001;mso-top-percent:-10001;v-text-anchor:top" o:gfxdata="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" filled="f">
             <o:lock v:ext="edit" rotation="t" aspectratio="t" verticies="t" text="t" shapetype="t"/>
             <w10:anchorlock/>
@@ -9614,7 +9616,7 @@
         </w:rPr>
       </w:r>
       <w:r>
-        <w:pict w14:anchorId="1F806E52">
+        <w:pict w14:anchorId="0A5B32DD">
           <v:rect id="Horizontal Line 14" o:spid="_x0000_s1029" style="width:468pt;height:1.1pt;visibility:visible;mso-wrap-style:square;mso-left-percent:-10001;mso-top-percent:-10001;mso-position-horizontal:absolute;mso-position-horizontal-relative:char;mso-position-vertical:absolute;mso-position-vertical-relative:line;mso-left-percent:-10001;mso-top-percent:-10001;v-text-anchor:top" o:gfxdata="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" filled="f">
             <o:lock v:ext="edit" rotation="t" aspectratio="t" verticies="t" text="t" shapetype="t"/>
             <w10:anchorlock/>
@@ -9646,6 +9648,7 @@
           <w:szCs w:val="48"/>
           <w14:ligatures w14:val="none"/>
         </w:rPr>
+        <w:lastRenderedPageBreak/>
         <w:t>Stage 14 — Factory pattern for creating level objects</w:t>
       </w:r>
     </w:p>
@@ -9874,7 +9877,7 @@
         </w:rPr>
       </w:r>
       <w:r>
-        <w:pict w14:anchorId="4F15AD02">
+        <w:pict w14:anchorId="33DA9864">
           <v:rect id="Horizontal Line 15" o:spid="_x0000_s1028" style="width:468pt;height:1.1pt;visibility:visible;mso-wrap-style:square;mso-left-percent:-10001;mso-top-percent:-10001;mso-position-horizontal:absolute;mso-position-horizontal-relative:char;mso-position-vertical:absolute;mso-position-vertical-relative:line;mso-left-percent:-10001;mso-top-percent:-10001;v-text-anchor:top" o:gfxdata="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" filled="f">
             <o:lock v:ext="edit" rotation="t" aspectratio="t" verticies="t" text="t" shapetype="t"/>
             <w10:anchorlock/>
@@ -10224,7 +10227,7 @@
         </w:rPr>
       </w:r>
       <w:r>
-        <w:pict w14:anchorId="0A4333A4">
+        <w:pict w14:anchorId="2B6AD098">
           <v:rect id="Horizontal Line 16" o:spid="_x0000_s1027" style="width:468pt;height:.05pt;visibility:visible;mso-wrap-style:square;mso-left-percent:-10001;mso-top-percent:-10001;mso-position-horizontal:absolute;mso-position-horizontal-relative:char;mso-position-vertical:absolute;mso-position-vertical-relative:line;mso-left-percent:-10001;mso-top-percent:-10001;v-text-anchor:top" o:gfxdata="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" filled="f">
             <o:lock v:ext="edit" rotation="t" aspectratio="t" verticies="t" text="t" shapetype="t"/>
             <w10:anchorlock/>
@@ -10256,6 +10259,7 @@
           <w:szCs w:val="48"/>
           <w14:ligatures w14:val="none"/>
         </w:rPr>
+        <w:lastRenderedPageBreak/>
         <w:t>Planned final file structure</w:t>
       </w:r>
     </w:p>
@@ -11150,7 +11154,7 @@
         </w:rPr>
       </w:r>
       <w:r>
-        <w:pict w14:anchorId="35D2C1C9">
+        <w:pict w14:anchorId="1FD1FD38">
           <v:rect id="Horizontal Line 17" o:spid="_x0000_s1026" style="width:468pt;height:1.1pt;visibility:visible;mso-wrap-style:square;mso-left-percent:-10001;mso-top-percent:-10001;mso-position-horizontal:absolute;mso-position-horizontal-relative:char;mso-position-vertical:absolute;mso-position-vertical-relative:line;mso-left-percent:-10001;mso-top-percent:-10001;v-text-anchor:top" o:gfxdata="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" filled="f">
             <o:lock v:ext="edit" rotation="t" aspectratio="t" verticies="t" text="t" shapetype="t"/>
             <w10:anchorlock/>
@@ -11840,25 +11844,25 @@
           <w:szCs w:val="20"/>
           <w14:ligatures w14:val="none"/>
         </w:rPr>
+        <w:t>16. Add visual and audio polish</w:t>
+      </w:r>
+    </w:p>
+    <w:p>
+      <w:pPr>
+        <w:spacing w:before="100" w:beforeAutospacing="1" w:after="100" w:afterAutospacing="1" w:line="240" w:lineRule="auto"/>
+        <w:rPr>
+          <w:rFonts w:ascii="Times New Roman" w:eastAsia="Times New Roman" w:hAnsi="Times New Roman" w:cs="Times New Roman"/>
+          <w:kern w:val="0"/>
+          <w14:ligatures w14:val="none"/>
+        </w:rPr>
+      </w:pPr>
+      <w:r>
+        <w:rPr>
+          <w:rFonts w:ascii="Times New Roman" w:eastAsia="Times New Roman" w:hAnsi="Times New Roman" w:cs="Times New Roman"/>
+          <w:kern w:val="0"/>
+          <w14:ligatures w14:val="none"/>
+        </w:rPr>
         <w:lastRenderedPageBreak/>
-        <w:t>16. Add visual and audio polish</w:t>
-      </w:r>
-    </w:p>
-    <w:p>
-      <w:pPr>
-        <w:spacing w:before="100" w:beforeAutospacing="1" w:after="100" w:afterAutospacing="1" w:line="240" w:lineRule="auto"/>
-        <w:rPr>
-          <w:rFonts w:ascii="Times New Roman" w:eastAsia="Times New Roman" w:hAnsi="Times New Roman" w:cs="Times New Roman"/>
-          <w:kern w:val="0"/>
-          <w14:ligatures w14:val="none"/>
-        </w:rPr>
-      </w:pPr>
-      <w:r>
-        <w:rPr>
-          <w:rFonts w:ascii="Times New Roman" w:eastAsia="Times New Roman" w:hAnsi="Times New Roman" w:cs="Times New Roman"/>
-          <w:kern w:val="0"/>
-          <w14:ligatures w14:val="none"/>
-        </w:rPr>
         <w:t xml:space="preserve">So yes: </w:t>
       </w:r>
       <w:r>

</xml_diff>